<commit_message>
V2.6: Fixed some prompt problems in generating images
</commit_message>
<xml_diff>
--- a/项目进度汇总.docx
+++ b/项目进度汇总.docx
@@ -4,7 +4,7 @@
   <w:body>
     <w:p>
       <w:pPr>
-        <w:spacing w:after="80"/>
+        <w:spacing w:before="0" w:after="80" w:line="276" w:lineRule="auto"/>
         <w:jc w:val="center"/>
       </w:pPr>
       <w:r>
@@ -19,7 +19,7 @@
     </w:p>
     <w:p>
       <w:pPr>
-        <w:spacing w:after="240"/>
+        <w:spacing w:before="0" w:after="240" w:line="276" w:lineRule="auto"/>
         <w:jc w:val="center"/>
       </w:pPr>
       <w:r>
@@ -34,7 +34,7 @@
     </w:p>
     <w:p>
       <w:pPr>
-        <w:spacing w:after="80" w:line="276" w:lineRule="auto"/>
+        <w:spacing w:before="0" w:after="80" w:line="276" w:lineRule="auto"/>
       </w:pPr>
       <w:r>
         <w:rPr>
@@ -48,7 +48,7 @@
     </w:p>
     <w:p>
       <w:pPr>
-        <w:spacing w:after="80" w:line="276" w:lineRule="auto"/>
+        <w:spacing w:before="0" w:after="80" w:line="276" w:lineRule="auto"/>
       </w:pPr>
       <w:r>
         <w:rPr>
@@ -62,7 +62,7 @@
     </w:p>
     <w:p>
       <w:pPr>
-        <w:spacing w:before="180" w:after="60"/>
+        <w:spacing w:before="180" w:after="60" w:line="276" w:lineRule="auto"/>
       </w:pPr>
       <w:r>
         <w:rPr>
@@ -77,7 +77,7 @@
     <w:p>
       <w:pPr>
         <w:pStyle w:val="ListNumber"/>
-        <w:spacing w:after="40" w:line="259" w:lineRule="auto"/>
+        <w:spacing w:before="0" w:after="40" w:line="259" w:lineRule="auto"/>
       </w:pPr>
       <w:r>
         <w:rPr>
@@ -92,7 +92,7 @@
     <w:p>
       <w:pPr>
         <w:pStyle w:val="ListNumber"/>
-        <w:spacing w:after="40" w:line="259" w:lineRule="auto"/>
+        <w:spacing w:before="0" w:after="40" w:line="259" w:lineRule="auto"/>
       </w:pPr>
       <w:r>
         <w:rPr>
@@ -107,7 +107,7 @@
     <w:p>
       <w:pPr>
         <w:pStyle w:val="ListNumber"/>
-        <w:spacing w:after="40" w:line="259" w:lineRule="auto"/>
+        <w:spacing w:before="0" w:after="40" w:line="259" w:lineRule="auto"/>
       </w:pPr>
       <w:r>
         <w:rPr>
@@ -122,7 +122,7 @@
     <w:p>
       <w:pPr>
         <w:pStyle w:val="ListNumber"/>
-        <w:spacing w:after="40" w:line="259" w:lineRule="auto"/>
+        <w:spacing w:before="0" w:after="40" w:line="259" w:lineRule="auto"/>
       </w:pPr>
       <w:r>
         <w:rPr>
@@ -137,7 +137,7 @@
     <w:p>
       <w:pPr>
         <w:pStyle w:val="ListNumber"/>
-        <w:spacing w:after="40" w:line="259" w:lineRule="auto"/>
+        <w:spacing w:before="0" w:after="40" w:line="259" w:lineRule="auto"/>
       </w:pPr>
       <w:r>
         <w:rPr>
@@ -152,7 +152,7 @@
     <w:p>
       <w:pPr>
         <w:pStyle w:val="ListNumber"/>
-        <w:spacing w:after="40" w:line="259" w:lineRule="auto"/>
+        <w:spacing w:before="0" w:after="40" w:line="259" w:lineRule="auto"/>
       </w:pPr>
       <w:r>
         <w:rPr>
@@ -167,7 +167,7 @@
     <w:p>
       <w:pPr>
         <w:pStyle w:val="ListNumber"/>
-        <w:spacing w:after="40" w:line="259" w:lineRule="auto"/>
+        <w:spacing w:before="0" w:after="40" w:line="259" w:lineRule="auto"/>
       </w:pPr>
       <w:r>
         <w:rPr>
@@ -182,7 +182,7 @@
     <w:p>
       <w:pPr>
         <w:pStyle w:val="ListNumber"/>
-        <w:spacing w:after="40" w:line="259" w:lineRule="auto"/>
+        <w:spacing w:before="0" w:after="40" w:line="259" w:lineRule="auto"/>
       </w:pPr>
       <w:r>
         <w:rPr>
@@ -197,7 +197,7 @@
     <w:p>
       <w:pPr>
         <w:pStyle w:val="ListNumber"/>
-        <w:spacing w:after="40" w:line="259" w:lineRule="auto"/>
+        <w:spacing w:before="0" w:after="40" w:line="259" w:lineRule="auto"/>
       </w:pPr>
       <w:r>
         <w:rPr>
@@ -212,7 +212,7 @@
     <w:p>
       <w:pPr>
         <w:pStyle w:val="ListNumber"/>
-        <w:spacing w:after="40" w:line="259" w:lineRule="auto"/>
+        <w:spacing w:before="0" w:after="40" w:line="259" w:lineRule="auto"/>
       </w:pPr>
       <w:r>
         <w:rPr>
@@ -227,7 +227,7 @@
     <w:p>
       <w:pPr>
         <w:pStyle w:val="ListNumber"/>
-        <w:spacing w:after="40" w:line="259" w:lineRule="auto"/>
+        <w:spacing w:before="0" w:after="40" w:line="259" w:lineRule="auto"/>
       </w:pPr>
       <w:r>
         <w:rPr>
@@ -242,7 +242,7 @@
     <w:p>
       <w:pPr>
         <w:pStyle w:val="ListNumber"/>
-        <w:spacing w:after="40" w:line="259" w:lineRule="auto"/>
+        <w:spacing w:before="0" w:after="40" w:line="259" w:lineRule="auto"/>
       </w:pPr>
       <w:r>
         <w:rPr>
@@ -257,7 +257,7 @@
     <w:p>
       <w:pPr>
         <w:pStyle w:val="ListNumber"/>
-        <w:spacing w:after="40" w:line="259" w:lineRule="auto"/>
+        <w:spacing w:before="0" w:after="40" w:line="259" w:lineRule="auto"/>
       </w:pPr>
       <w:r>
         <w:rPr>
@@ -271,7 +271,7 @@
     </w:p>
     <w:p>
       <w:pPr>
-        <w:spacing w:before="180" w:after="60"/>
+        <w:spacing w:before="180" w:after="60" w:line="276" w:lineRule="auto"/>
       </w:pPr>
       <w:r>
         <w:rPr>
@@ -285,7 +285,7 @@
     </w:p>
     <w:p>
       <w:pPr>
-        <w:spacing w:after="80" w:line="276" w:lineRule="auto"/>
+        <w:spacing w:before="0" w:after="80" w:line="276" w:lineRule="auto"/>
       </w:pPr>
       <w:r>
         <w:rPr>
@@ -300,7 +300,7 @@
     <w:p>
       <w:pPr>
         <w:pStyle w:val="ListBullet"/>
-        <w:spacing w:after="40" w:line="259" w:lineRule="auto"/>
+        <w:spacing w:before="0" w:after="40" w:line="259" w:lineRule="auto"/>
       </w:pPr>
       <w:r>
         <w:rPr>
@@ -315,7 +315,7 @@
     <w:p>
       <w:pPr>
         <w:pStyle w:val="ListBullet"/>
-        <w:spacing w:after="40" w:line="259" w:lineRule="auto"/>
+        <w:spacing w:before="0" w:after="40" w:line="259" w:lineRule="auto"/>
       </w:pPr>
       <w:r>
         <w:rPr>
@@ -330,7 +330,7 @@
     <w:p>
       <w:pPr>
         <w:pStyle w:val="ListBullet"/>
-        <w:spacing w:after="40" w:line="259" w:lineRule="auto"/>
+        <w:spacing w:before="0" w:after="40" w:line="259" w:lineRule="auto"/>
       </w:pPr>
       <w:r>
         <w:rPr>
@@ -345,7 +345,7 @@
     <w:p>
       <w:pPr>
         <w:pStyle w:val="ListBullet"/>
-        <w:spacing w:after="40" w:line="259" w:lineRule="auto"/>
+        <w:spacing w:before="0" w:after="40" w:line="259" w:lineRule="auto"/>
       </w:pPr>
       <w:r>
         <w:rPr>
@@ -360,7 +360,7 @@
     <w:p>
       <w:pPr>
         <w:pStyle w:val="ListBullet"/>
-        <w:spacing w:after="40" w:line="259" w:lineRule="auto"/>
+        <w:spacing w:before="0" w:after="40" w:line="259" w:lineRule="auto"/>
       </w:pPr>
       <w:r>
         <w:rPr>
@@ -375,7 +375,7 @@
     <w:p>
       <w:pPr>
         <w:pStyle w:val="ListBullet"/>
-        <w:spacing w:after="40" w:line="259" w:lineRule="auto"/>
+        <w:spacing w:before="0" w:after="40" w:line="259" w:lineRule="auto"/>
       </w:pPr>
       <w:r>
         <w:rPr>
@@ -390,7 +390,7 @@
     <w:p>
       <w:pPr>
         <w:pStyle w:val="ListBullet"/>
-        <w:spacing w:after="40" w:line="259" w:lineRule="auto"/>
+        <w:spacing w:before="0" w:after="40" w:line="259" w:lineRule="auto"/>
       </w:pPr>
       <w:r>
         <w:rPr>
@@ -405,7 +405,7 @@
     <w:p>
       <w:pPr>
         <w:pStyle w:val="ListBullet"/>
-        <w:spacing w:after="40" w:line="259" w:lineRule="auto"/>
+        <w:spacing w:before="0" w:after="40" w:line="259" w:lineRule="auto"/>
       </w:pPr>
       <w:r>
         <w:rPr>
@@ -419,7 +419,7 @@
     </w:p>
     <w:p>
       <w:pPr>
-        <w:spacing w:after="80" w:line="276" w:lineRule="auto"/>
+        <w:spacing w:before="0" w:after="80" w:line="276" w:lineRule="auto"/>
       </w:pPr>
       <w:r>
         <w:rPr>
@@ -434,7 +434,7 @@
     <w:p>
       <w:pPr>
         <w:pStyle w:val="ListBullet"/>
-        <w:spacing w:after="40" w:line="259" w:lineRule="auto"/>
+        <w:spacing w:before="0" w:after="40" w:line="259" w:lineRule="auto"/>
       </w:pPr>
       <w:r>
         <w:rPr>
@@ -449,7 +449,7 @@
     <w:p>
       <w:pPr>
         <w:pStyle w:val="ListBullet"/>
-        <w:spacing w:after="40" w:line="259" w:lineRule="auto"/>
+        <w:spacing w:before="0" w:after="40" w:line="259" w:lineRule="auto"/>
       </w:pPr>
       <w:r>
         <w:rPr>
@@ -464,7 +464,7 @@
     <w:p>
       <w:pPr>
         <w:pStyle w:val="ListBullet"/>
-        <w:spacing w:after="40" w:line="259" w:lineRule="auto"/>
+        <w:spacing w:before="0" w:after="40" w:line="259" w:lineRule="auto"/>
       </w:pPr>
       <w:r>
         <w:rPr>
@@ -479,7 +479,7 @@
     <w:p>
       <w:pPr>
         <w:pStyle w:val="ListBullet"/>
-        <w:spacing w:after="40" w:line="259" w:lineRule="auto"/>
+        <w:spacing w:before="0" w:after="40" w:line="259" w:lineRule="auto"/>
       </w:pPr>
       <w:r>
         <w:rPr>
@@ -494,7 +494,7 @@
     <w:p>
       <w:pPr>
         <w:pStyle w:val="ListBullet"/>
-        <w:spacing w:after="40" w:line="259" w:lineRule="auto"/>
+        <w:spacing w:before="0" w:after="40" w:line="259" w:lineRule="auto"/>
       </w:pPr>
       <w:r>
         <w:rPr>
@@ -509,7 +509,7 @@
     <w:p>
       <w:pPr>
         <w:pStyle w:val="ListBullet"/>
-        <w:spacing w:after="40" w:line="259" w:lineRule="auto"/>
+        <w:spacing w:before="0" w:after="40" w:line="259" w:lineRule="auto"/>
       </w:pPr>
       <w:r>
         <w:rPr>
@@ -524,7 +524,7 @@
     <w:p>
       <w:pPr>
         <w:pStyle w:val="ListBullet"/>
-        <w:spacing w:after="40" w:line="259" w:lineRule="auto"/>
+        <w:spacing w:before="0" w:after="40" w:line="259" w:lineRule="auto"/>
       </w:pPr>
       <w:r>
         <w:rPr>
@@ -538,7 +538,7 @@
     </w:p>
     <w:p>
       <w:pPr>
-        <w:spacing w:after="80" w:line="276" w:lineRule="auto"/>
+        <w:spacing w:before="0" w:after="80" w:line="276" w:lineRule="auto"/>
       </w:pPr>
       <w:r>
         <w:rPr>
@@ -552,7 +552,7 @@
     </w:p>
     <w:p>
       <w:pPr>
-        <w:spacing w:before="180" w:after="60"/>
+        <w:spacing w:before="180" w:after="60" w:line="276" w:lineRule="auto"/>
       </w:pPr>
       <w:r>
         <w:rPr>
@@ -566,7 +566,7 @@
     </w:p>
     <w:p>
       <w:pPr>
-        <w:spacing w:after="80" w:line="276" w:lineRule="auto"/>
+        <w:spacing w:before="0" w:after="80" w:line="276" w:lineRule="auto"/>
       </w:pPr>
       <w:r>
         <w:rPr>
@@ -581,7 +581,7 @@
     <w:p>
       <w:pPr>
         <w:pStyle w:val="ListBullet"/>
-        <w:spacing w:after="40" w:line="259" w:lineRule="auto"/>
+        <w:spacing w:before="0" w:after="40" w:line="259" w:lineRule="auto"/>
       </w:pPr>
       <w:r>
         <w:rPr>
@@ -596,7 +596,7 @@
     <w:p>
       <w:pPr>
         <w:pStyle w:val="ListBullet"/>
-        <w:spacing w:after="40" w:line="259" w:lineRule="auto"/>
+        <w:spacing w:before="0" w:after="40" w:line="259" w:lineRule="auto"/>
       </w:pPr>
       <w:r>
         <w:rPr>
@@ -611,7 +611,7 @@
     <w:p>
       <w:pPr>
         <w:pStyle w:val="ListBullet"/>
-        <w:spacing w:after="40" w:line="259" w:lineRule="auto"/>
+        <w:spacing w:before="0" w:after="40" w:line="259" w:lineRule="auto"/>
       </w:pPr>
       <w:r>
         <w:rPr>
@@ -626,7 +626,7 @@
     <w:p>
       <w:pPr>
         <w:pStyle w:val="ListBullet"/>
-        <w:spacing w:after="40" w:line="259" w:lineRule="auto"/>
+        <w:spacing w:before="0" w:after="40" w:line="259" w:lineRule="auto"/>
       </w:pPr>
       <w:r>
         <w:rPr>
@@ -641,7 +641,7 @@
     <w:p>
       <w:pPr>
         <w:pStyle w:val="ListBullet"/>
-        <w:spacing w:after="40" w:line="259" w:lineRule="auto"/>
+        <w:spacing w:before="0" w:after="40" w:line="259" w:lineRule="auto"/>
       </w:pPr>
       <w:r>
         <w:rPr>
@@ -656,7 +656,7 @@
     <w:p>
       <w:pPr>
         <w:pStyle w:val="ListBullet"/>
-        <w:spacing w:after="40" w:line="259" w:lineRule="auto"/>
+        <w:spacing w:before="0" w:after="40" w:line="259" w:lineRule="auto"/>
       </w:pPr>
       <w:r>
         <w:rPr>
@@ -671,7 +671,7 @@
     <w:p>
       <w:pPr>
         <w:pStyle w:val="ListBullet"/>
-        <w:spacing w:after="40" w:line="259" w:lineRule="auto"/>
+        <w:spacing w:before="0" w:after="40" w:line="259" w:lineRule="auto"/>
       </w:pPr>
       <w:r>
         <w:rPr>
@@ -685,7 +685,7 @@
     </w:p>
     <w:p>
       <w:pPr>
-        <w:spacing w:after="80" w:line="276" w:lineRule="auto"/>
+        <w:spacing w:before="0" w:after="80" w:line="276" w:lineRule="auto"/>
       </w:pPr>
       <w:r>
         <w:rPr>
@@ -700,7 +700,7 @@
     <w:p>
       <w:pPr>
         <w:pStyle w:val="ListBullet"/>
-        <w:spacing w:after="40" w:line="259" w:lineRule="auto"/>
+        <w:spacing w:before="0" w:after="40" w:line="259" w:lineRule="auto"/>
       </w:pPr>
       <w:r>
         <w:rPr>
@@ -715,7 +715,7 @@
     <w:p>
       <w:pPr>
         <w:pStyle w:val="ListBullet"/>
-        <w:spacing w:after="40" w:line="259" w:lineRule="auto"/>
+        <w:spacing w:before="0" w:after="40" w:line="259" w:lineRule="auto"/>
       </w:pPr>
       <w:r>
         <w:rPr>
@@ -730,7 +730,7 @@
     <w:p>
       <w:pPr>
         <w:pStyle w:val="ListBullet"/>
-        <w:spacing w:after="40" w:line="259" w:lineRule="auto"/>
+        <w:spacing w:before="0" w:after="40" w:line="259" w:lineRule="auto"/>
       </w:pPr>
       <w:r>
         <w:rPr>
@@ -745,7 +745,7 @@
     <w:p>
       <w:pPr>
         <w:pStyle w:val="ListBullet"/>
-        <w:spacing w:after="40" w:line="259" w:lineRule="auto"/>
+        <w:spacing w:before="0" w:after="40" w:line="259" w:lineRule="auto"/>
       </w:pPr>
       <w:r>
         <w:rPr>
@@ -760,7 +760,7 @@
     <w:p>
       <w:pPr>
         <w:pStyle w:val="ListBullet"/>
-        <w:spacing w:after="40" w:line="259" w:lineRule="auto"/>
+        <w:spacing w:before="0" w:after="40" w:line="259" w:lineRule="auto"/>
       </w:pPr>
       <w:r>
         <w:rPr>
@@ -774,7 +774,7 @@
     </w:p>
     <w:p>
       <w:pPr>
-        <w:spacing w:after="80" w:line="276" w:lineRule="auto"/>
+        <w:spacing w:before="0" w:after="80" w:line="276" w:lineRule="auto"/>
       </w:pPr>
       <w:r>
         <w:rPr>
@@ -789,7 +789,7 @@
     <w:p>
       <w:pPr>
         <w:pStyle w:val="ListBullet"/>
-        <w:spacing w:after="40" w:line="259" w:lineRule="auto"/>
+        <w:spacing w:before="0" w:after="40" w:line="259" w:lineRule="auto"/>
       </w:pPr>
       <w:r>
         <w:rPr>
@@ -804,7 +804,7 @@
     <w:p>
       <w:pPr>
         <w:pStyle w:val="ListBullet"/>
-        <w:spacing w:after="40" w:line="259" w:lineRule="auto"/>
+        <w:spacing w:before="0" w:after="40" w:line="259" w:lineRule="auto"/>
       </w:pPr>
       <w:r>
         <w:rPr>
@@ -819,7 +819,7 @@
     <w:p>
       <w:pPr>
         <w:pStyle w:val="ListBullet"/>
-        <w:spacing w:after="40" w:line="259" w:lineRule="auto"/>
+        <w:spacing w:before="0" w:after="40" w:line="259" w:lineRule="auto"/>
       </w:pPr>
       <w:r>
         <w:rPr>
@@ -833,7 +833,7 @@
     </w:p>
     <w:p>
       <w:pPr>
-        <w:spacing w:after="80" w:line="276" w:lineRule="auto"/>
+        <w:spacing w:before="0" w:after="80" w:line="276" w:lineRule="auto"/>
       </w:pPr>
       <w:r>
         <w:rPr>
@@ -848,7 +848,7 @@
     <w:p>
       <w:pPr>
         <w:pStyle w:val="ListBullet"/>
-        <w:spacing w:after="40" w:line="259" w:lineRule="auto"/>
+        <w:spacing w:before="0" w:after="40" w:line="259" w:lineRule="auto"/>
       </w:pPr>
       <w:r>
         <w:rPr>
@@ -863,7 +863,7 @@
     <w:p>
       <w:pPr>
         <w:pStyle w:val="ListBullet"/>
-        <w:spacing w:after="40" w:line="259" w:lineRule="auto"/>
+        <w:spacing w:before="0" w:after="40" w:line="259" w:lineRule="auto"/>
       </w:pPr>
       <w:r>
         <w:rPr>
@@ -878,7 +878,7 @@
     <w:p>
       <w:pPr>
         <w:pStyle w:val="ListBullet"/>
-        <w:spacing w:after="40" w:line="259" w:lineRule="auto"/>
+        <w:spacing w:before="0" w:after="40" w:line="259" w:lineRule="auto"/>
       </w:pPr>
       <w:r>
         <w:rPr>
@@ -893,7 +893,7 @@
     <w:p>
       <w:pPr>
         <w:pStyle w:val="ListBullet"/>
-        <w:spacing w:after="40" w:line="259" w:lineRule="auto"/>
+        <w:spacing w:before="0" w:after="40" w:line="259" w:lineRule="auto"/>
       </w:pPr>
       <w:r>
         <w:rPr>
@@ -907,7 +907,7 @@
     </w:p>
     <w:p>
       <w:pPr>
-        <w:spacing w:before="180" w:after="60"/>
+        <w:spacing w:before="180" w:after="60" w:line="276" w:lineRule="auto"/>
       </w:pPr>
       <w:r>
         <w:rPr>
@@ -921,7 +921,7 @@
     </w:p>
     <w:p>
       <w:pPr>
-        <w:spacing w:after="80" w:line="276" w:lineRule="auto"/>
+        <w:spacing w:before="0" w:after="80" w:line="276" w:lineRule="auto"/>
       </w:pPr>
       <w:r>
         <w:rPr>
@@ -936,7 +936,7 @@
     <w:p>
       <w:pPr>
         <w:pStyle w:val="ListBullet"/>
-        <w:spacing w:after="40" w:line="259" w:lineRule="auto"/>
+        <w:spacing w:before="0" w:after="40" w:line="259" w:lineRule="auto"/>
       </w:pPr>
       <w:r>
         <w:rPr>
@@ -951,7 +951,7 @@
     <w:p>
       <w:pPr>
         <w:pStyle w:val="ListBullet"/>
-        <w:spacing w:after="40" w:line="259" w:lineRule="auto"/>
+        <w:spacing w:before="0" w:after="40" w:line="259" w:lineRule="auto"/>
       </w:pPr>
       <w:r>
         <w:rPr>
@@ -966,7 +966,7 @@
     <w:p>
       <w:pPr>
         <w:pStyle w:val="ListBullet"/>
-        <w:spacing w:after="40" w:line="259" w:lineRule="auto"/>
+        <w:spacing w:before="0" w:after="40" w:line="259" w:lineRule="auto"/>
       </w:pPr>
       <w:r>
         <w:rPr>
@@ -981,7 +981,7 @@
     <w:p>
       <w:pPr>
         <w:pStyle w:val="ListBullet"/>
-        <w:spacing w:after="40" w:line="259" w:lineRule="auto"/>
+        <w:spacing w:before="0" w:after="40" w:line="259" w:lineRule="auto"/>
       </w:pPr>
       <w:r>
         <w:rPr>
@@ -996,7 +996,7 @@
     <w:p>
       <w:pPr>
         <w:pStyle w:val="ListBullet"/>
-        <w:spacing w:after="40" w:line="259" w:lineRule="auto"/>
+        <w:spacing w:before="0" w:after="40" w:line="259" w:lineRule="auto"/>
       </w:pPr>
       <w:r>
         <w:rPr>
@@ -1010,7 +1010,7 @@
     </w:p>
     <w:p>
       <w:pPr>
-        <w:spacing w:after="80" w:line="276" w:lineRule="auto"/>
+        <w:spacing w:before="0" w:after="80" w:line="276" w:lineRule="auto"/>
       </w:pPr>
       <w:r>
         <w:rPr>
@@ -1024,7 +1024,7 @@
     </w:p>
     <w:p>
       <w:pPr>
-        <w:spacing w:before="180" w:after="60"/>
+        <w:spacing w:before="180" w:after="60" w:line="276" w:lineRule="auto"/>
       </w:pPr>
       <w:r>
         <w:rPr>
@@ -1038,7 +1038,7 @@
     </w:p>
     <w:p>
       <w:pPr>
-        <w:spacing w:after="80" w:line="276" w:lineRule="auto"/>
+        <w:spacing w:before="0" w:after="80" w:line="276" w:lineRule="auto"/>
       </w:pPr>
       <w:r>
         <w:rPr>
@@ -1053,7 +1053,7 @@
     <w:p>
       <w:pPr>
         <w:pStyle w:val="ListBullet"/>
-        <w:spacing w:after="40" w:line="259" w:lineRule="auto"/>
+        <w:spacing w:before="0" w:after="40" w:line="259" w:lineRule="auto"/>
       </w:pPr>
       <w:r>
         <w:rPr>
@@ -1068,7 +1068,7 @@
     <w:p>
       <w:pPr>
         <w:pStyle w:val="ListBullet"/>
-        <w:spacing w:after="40" w:line="259" w:lineRule="auto"/>
+        <w:spacing w:before="0" w:after="40" w:line="259" w:lineRule="auto"/>
       </w:pPr>
       <w:r>
         <w:rPr>
@@ -1083,7 +1083,7 @@
     <w:p>
       <w:pPr>
         <w:pStyle w:val="ListBullet"/>
-        <w:spacing w:after="40" w:line="259" w:lineRule="auto"/>
+        <w:spacing w:before="0" w:after="40" w:line="259" w:lineRule="auto"/>
       </w:pPr>
       <w:r>
         <w:rPr>
@@ -1098,7 +1098,7 @@
     <w:p>
       <w:pPr>
         <w:pStyle w:val="ListBullet"/>
-        <w:spacing w:after="40" w:line="259" w:lineRule="auto"/>
+        <w:spacing w:before="0" w:after="40" w:line="259" w:lineRule="auto"/>
       </w:pPr>
       <w:r>
         <w:rPr>
@@ -1113,7 +1113,7 @@
     <w:p>
       <w:pPr>
         <w:pStyle w:val="ListBullet"/>
-        <w:spacing w:after="40" w:line="259" w:lineRule="auto"/>
+        <w:spacing w:before="0" w:after="40" w:line="259" w:lineRule="auto"/>
       </w:pPr>
       <w:r>
         <w:rPr>
@@ -1127,7 +1127,7 @@
     </w:p>
     <w:p>
       <w:pPr>
-        <w:spacing w:after="80" w:line="276" w:lineRule="auto"/>
+        <w:spacing w:before="0" w:after="80" w:line="276" w:lineRule="auto"/>
       </w:pPr>
       <w:r>
         <w:rPr>
@@ -1142,7 +1142,7 @@
     <w:p>
       <w:pPr>
         <w:pStyle w:val="ListBullet"/>
-        <w:spacing w:after="40" w:line="259" w:lineRule="auto"/>
+        <w:spacing w:before="0" w:after="40" w:line="259" w:lineRule="auto"/>
       </w:pPr>
       <w:r>
         <w:rPr>
@@ -1157,7 +1157,7 @@
     <w:p>
       <w:pPr>
         <w:pStyle w:val="ListBullet"/>
-        <w:spacing w:after="40" w:line="259" w:lineRule="auto"/>
+        <w:spacing w:before="0" w:after="40" w:line="259" w:lineRule="auto"/>
       </w:pPr>
       <w:r>
         <w:rPr>
@@ -1172,7 +1172,7 @@
     <w:p>
       <w:pPr>
         <w:pStyle w:val="ListBullet"/>
-        <w:spacing w:after="40" w:line="259" w:lineRule="auto"/>
+        <w:spacing w:before="0" w:after="40" w:line="259" w:lineRule="auto"/>
       </w:pPr>
       <w:r>
         <w:rPr>
@@ -1187,7 +1187,7 @@
     <w:p>
       <w:pPr>
         <w:pStyle w:val="ListBullet"/>
-        <w:spacing w:after="40" w:line="259" w:lineRule="auto"/>
+        <w:spacing w:before="0" w:after="40" w:line="259" w:lineRule="auto"/>
       </w:pPr>
       <w:r>
         <w:rPr>
@@ -1201,7 +1201,7 @@
     </w:p>
     <w:p>
       <w:pPr>
-        <w:spacing w:after="80" w:line="276" w:lineRule="auto"/>
+        <w:spacing w:before="0" w:after="80" w:line="276" w:lineRule="auto"/>
       </w:pPr>
       <w:r>
         <w:rPr>
@@ -1216,7 +1216,7 @@
     <w:p>
       <w:pPr>
         <w:pStyle w:val="ListBullet"/>
-        <w:spacing w:after="40" w:line="259" w:lineRule="auto"/>
+        <w:spacing w:before="0" w:after="40" w:line="259" w:lineRule="auto"/>
       </w:pPr>
       <w:r>
         <w:rPr>
@@ -1231,7 +1231,7 @@
     <w:p>
       <w:pPr>
         <w:pStyle w:val="ListBullet"/>
-        <w:spacing w:after="40" w:line="259" w:lineRule="auto"/>
+        <w:spacing w:before="0" w:after="40" w:line="259" w:lineRule="auto"/>
       </w:pPr>
       <w:r>
         <w:rPr>
@@ -1246,7 +1246,7 @@
     <w:p>
       <w:pPr>
         <w:pStyle w:val="ListBullet"/>
-        <w:spacing w:after="40" w:line="259" w:lineRule="auto"/>
+        <w:spacing w:before="0" w:after="40" w:line="259" w:lineRule="auto"/>
       </w:pPr>
       <w:r>
         <w:rPr>
@@ -1255,13 +1255,43 @@
           <w:color w:val="20242A"/>
           <w:sz w:val="19"/>
         </w:rPr>
-        <w:t>只展示出现次数大于等于 2 次的词。</w:t>
+        <w:t>高频词优先展示，出现次数大于等于 2 次的词排在前面。</w:t>
       </w:r>
     </w:p>
     <w:p>
       <w:pPr>
         <w:pStyle w:val="ListBullet"/>
-        <w:spacing w:after="40" w:line="259" w:lineRule="auto"/>
+        <w:spacing w:before="0" w:after="40" w:line="259" w:lineRule="auto"/>
+      </w:pPr>
+      <w:r>
+        <w:rPr>
+          <w:rFonts w:ascii="Microsoft YaHei" w:hAnsi="Microsoft YaHei" w:eastAsia="Microsoft YaHei"/>
+          <w:b w:val="0"/>
+          <w:color w:val="20242A"/>
+          <w:sz w:val="19"/>
+        </w:rPr>
+        <w:t>如果高频词不足，会补充少量模型最近抽取的一次性关键词，避免偏好区过空。</w:t>
+      </w:r>
+    </w:p>
+    <w:p>
+      <w:pPr>
+        <w:pStyle w:val="ListBullet"/>
+        <w:spacing w:before="0" w:after="40" w:line="259" w:lineRule="auto"/>
+      </w:pPr>
+      <w:r>
+        <w:rPr>
+          <w:rFonts w:ascii="Microsoft YaHei" w:hAnsi="Microsoft YaHei" w:eastAsia="Microsoft YaHei"/>
+          <w:b w:val="0"/>
+          <w:color w:val="20242A"/>
+          <w:sz w:val="19"/>
+        </w:rPr>
+        <w:t>最多展示 8 个偏好词。</w:t>
+      </w:r>
+    </w:p>
+    <w:p>
+      <w:pPr>
+        <w:pStyle w:val="ListBullet"/>
+        <w:spacing w:before="0" w:after="40" w:line="259" w:lineRule="auto"/>
       </w:pPr>
       <w:r>
         <w:rPr>
@@ -1275,7 +1305,7 @@
     </w:p>
     <w:p>
       <w:pPr>
-        <w:spacing w:after="80" w:line="276" w:lineRule="auto"/>
+        <w:spacing w:before="0" w:after="80" w:line="276" w:lineRule="auto"/>
       </w:pPr>
       <w:r>
         <w:rPr>
@@ -1290,7 +1320,7 @@
     <w:p>
       <w:pPr>
         <w:pStyle w:val="ListBullet"/>
-        <w:spacing w:after="40" w:line="259" w:lineRule="auto"/>
+        <w:spacing w:before="0" w:after="40" w:line="259" w:lineRule="auto"/>
       </w:pPr>
       <w:r>
         <w:rPr>
@@ -1305,7 +1335,7 @@
     <w:p>
       <w:pPr>
         <w:pStyle w:val="ListBullet"/>
-        <w:spacing w:after="40" w:line="259" w:lineRule="auto"/>
+        <w:spacing w:before="0" w:after="40" w:line="259" w:lineRule="auto"/>
       </w:pPr>
       <w:r>
         <w:rPr>
@@ -1320,7 +1350,7 @@
     <w:p>
       <w:pPr>
         <w:pStyle w:val="ListBullet"/>
-        <w:spacing w:after="40" w:line="259" w:lineRule="auto"/>
+        <w:spacing w:before="0" w:after="40" w:line="259" w:lineRule="auto"/>
       </w:pPr>
       <w:r>
         <w:rPr>
@@ -1335,7 +1365,7 @@
     <w:p>
       <w:pPr>
         <w:pStyle w:val="ListBullet"/>
-        <w:spacing w:after="40" w:line="259" w:lineRule="auto"/>
+        <w:spacing w:before="0" w:after="40" w:line="259" w:lineRule="auto"/>
       </w:pPr>
       <w:r>
         <w:rPr>
@@ -1349,7 +1379,7 @@
     </w:p>
     <w:p>
       <w:pPr>
-        <w:spacing w:before="180" w:after="60"/>
+        <w:spacing w:before="180" w:after="60" w:line="276" w:lineRule="auto"/>
       </w:pPr>
       <w:r>
         <w:rPr>
@@ -1363,7 +1393,7 @@
     </w:p>
     <w:p>
       <w:pPr>
-        <w:spacing w:after="80" w:line="276" w:lineRule="auto"/>
+        <w:spacing w:before="0" w:after="80" w:line="276" w:lineRule="auto"/>
       </w:pPr>
       <w:r>
         <w:rPr>
@@ -1378,7 +1408,7 @@
     <w:p>
       <w:pPr>
         <w:pStyle w:val="ListBullet"/>
-        <w:spacing w:after="40" w:line="259" w:lineRule="auto"/>
+        <w:spacing w:before="0" w:after="40" w:line="259" w:lineRule="auto"/>
       </w:pPr>
       <w:r>
         <w:rPr>
@@ -1393,7 +1423,7 @@
     <w:p>
       <w:pPr>
         <w:pStyle w:val="ListBullet"/>
-        <w:spacing w:after="40" w:line="259" w:lineRule="auto"/>
+        <w:spacing w:before="0" w:after="40" w:line="259" w:lineRule="auto"/>
       </w:pPr>
       <w:r>
         <w:rPr>
@@ -1408,7 +1438,7 @@
     <w:p>
       <w:pPr>
         <w:pStyle w:val="ListBullet"/>
-        <w:spacing w:after="40" w:line="259" w:lineRule="auto"/>
+        <w:spacing w:before="0" w:after="40" w:line="259" w:lineRule="auto"/>
       </w:pPr>
       <w:r>
         <w:rPr>
@@ -1423,7 +1453,7 @@
     <w:p>
       <w:pPr>
         <w:pStyle w:val="ListBullet"/>
-        <w:spacing w:after="40" w:line="259" w:lineRule="auto"/>
+        <w:spacing w:before="0" w:after="40" w:line="259" w:lineRule="auto"/>
       </w:pPr>
       <w:r>
         <w:rPr>
@@ -1437,7 +1467,7 @@
     </w:p>
     <w:p>
       <w:pPr>
-        <w:spacing w:after="80" w:line="276" w:lineRule="auto"/>
+        <w:spacing w:before="0" w:after="80" w:line="276" w:lineRule="auto"/>
       </w:pPr>
       <w:r>
         <w:rPr>
@@ -1451,7 +1481,7 @@
     </w:p>
     <w:p>
       <w:pPr>
-        <w:spacing w:before="180" w:after="60"/>
+        <w:spacing w:before="180" w:after="60" w:line="276" w:lineRule="auto"/>
       </w:pPr>
       <w:r>
         <w:rPr>
@@ -1465,7 +1495,7 @@
     </w:p>
     <w:p>
       <w:pPr>
-        <w:spacing w:after="80" w:line="276" w:lineRule="auto"/>
+        <w:spacing w:before="0" w:after="80" w:line="276" w:lineRule="auto"/>
       </w:pPr>
       <w:r>
         <w:rPr>
@@ -1480,7 +1510,7 @@
     <w:p>
       <w:pPr>
         <w:pStyle w:val="ListBullet"/>
-        <w:spacing w:after="40" w:line="259" w:lineRule="auto"/>
+        <w:spacing w:before="0" w:after="40" w:line="259" w:lineRule="auto"/>
       </w:pPr>
       <w:r>
         <w:rPr>
@@ -1495,7 +1525,7 @@
     <w:p>
       <w:pPr>
         <w:pStyle w:val="ListBullet"/>
-        <w:spacing w:after="40" w:line="259" w:lineRule="auto"/>
+        <w:spacing w:before="0" w:after="40" w:line="259" w:lineRule="auto"/>
       </w:pPr>
       <w:r>
         <w:rPr>
@@ -1510,7 +1540,7 @@
     <w:p>
       <w:pPr>
         <w:pStyle w:val="ListBullet"/>
-        <w:spacing w:after="40" w:line="259" w:lineRule="auto"/>
+        <w:spacing w:before="0" w:after="40" w:line="259" w:lineRule="auto"/>
       </w:pPr>
       <w:r>
         <w:rPr>
@@ -1525,7 +1555,7 @@
     <w:p>
       <w:pPr>
         <w:pStyle w:val="ListBullet"/>
-        <w:spacing w:after="40" w:line="259" w:lineRule="auto"/>
+        <w:spacing w:before="0" w:after="40" w:line="259" w:lineRule="auto"/>
       </w:pPr>
       <w:r>
         <w:rPr>
@@ -1540,7 +1570,7 @@
     <w:p>
       <w:pPr>
         <w:pStyle w:val="ListBullet"/>
-        <w:spacing w:after="40" w:line="259" w:lineRule="auto"/>
+        <w:spacing w:before="0" w:after="40" w:line="259" w:lineRule="auto"/>
       </w:pPr>
       <w:r>
         <w:rPr>
@@ -1554,7 +1584,7 @@
     </w:p>
     <w:p>
       <w:pPr>
-        <w:spacing w:before="180" w:after="60"/>
+        <w:spacing w:before="180" w:after="60" w:line="276" w:lineRule="auto"/>
       </w:pPr>
       <w:r>
         <w:rPr>
@@ -1568,7 +1598,7 @@
     </w:p>
     <w:p>
       <w:pPr>
-        <w:spacing w:after="80" w:line="276" w:lineRule="auto"/>
+        <w:spacing w:before="0" w:after="80" w:line="276" w:lineRule="auto"/>
       </w:pPr>
       <w:r>
         <w:rPr>
@@ -1582,7 +1612,7 @@
     </w:p>
     <w:p>
       <w:pPr>
-        <w:spacing w:after="80" w:line="276" w:lineRule="auto"/>
+        <w:spacing w:before="0" w:after="80" w:line="276" w:lineRule="auto"/>
       </w:pPr>
       <w:r>
         <w:rPr>
@@ -1597,7 +1627,7 @@
     <w:p>
       <w:pPr>
         <w:pStyle w:val="ListBullet"/>
-        <w:spacing w:after="40" w:line="259" w:lineRule="auto"/>
+        <w:spacing w:before="0" w:after="40" w:line="259" w:lineRule="auto"/>
       </w:pPr>
       <w:r>
         <w:rPr>
@@ -1612,7 +1642,7 @@
     <w:p>
       <w:pPr>
         <w:pStyle w:val="ListBullet"/>
-        <w:spacing w:after="40" w:line="259" w:lineRule="auto"/>
+        <w:spacing w:before="0" w:after="40" w:line="259" w:lineRule="auto"/>
       </w:pPr>
       <w:r>
         <w:rPr>
@@ -1627,7 +1657,7 @@
     <w:p>
       <w:pPr>
         <w:pStyle w:val="ListBullet"/>
-        <w:spacing w:after="40" w:line="259" w:lineRule="auto"/>
+        <w:spacing w:before="0" w:after="40" w:line="259" w:lineRule="auto"/>
       </w:pPr>
       <w:r>
         <w:rPr>
@@ -1642,7 +1672,7 @@
     <w:p>
       <w:pPr>
         <w:pStyle w:val="ListBullet"/>
-        <w:spacing w:after="40" w:line="259" w:lineRule="auto"/>
+        <w:spacing w:before="0" w:after="40" w:line="259" w:lineRule="auto"/>
       </w:pPr>
       <w:r>
         <w:rPr>
@@ -1657,7 +1687,7 @@
     <w:p>
       <w:pPr>
         <w:pStyle w:val="ListBullet"/>
-        <w:spacing w:after="40" w:line="259" w:lineRule="auto"/>
+        <w:spacing w:before="0" w:after="40" w:line="259" w:lineRule="auto"/>
       </w:pPr>
       <w:r>
         <w:rPr>
@@ -1666,13 +1696,13 @@
           <w:color w:val="20242A"/>
           <w:sz w:val="19"/>
         </w:rPr>
-        <w:t>只展示头部以下的身体部分。</w:t>
+        <w:t>帽子判断只看实际搭配单品的名称/类别中是否有“帽”；连帽卫衣、连帽夹克不算帽子，挎包、斜挎包、托特包、背包、小肩包等包类也不算帽子。</w:t>
       </w:r>
     </w:p>
     <w:p>
       <w:pPr>
         <w:pStyle w:val="ListBullet"/>
-        <w:spacing w:after="40" w:line="259" w:lineRule="auto"/>
+        <w:spacing w:before="0" w:after="40" w:line="259" w:lineRule="auto"/>
       </w:pPr>
       <w:r>
         <w:rPr>
@@ -1681,13 +1711,13 @@
           <w:color w:val="20242A"/>
           <w:sz w:val="19"/>
         </w:rPr>
-        <w:t>画面从脖颈或肩部以下开始裁切。</w:t>
+        <w:t>如果搭配中没有帽子元素，图像必须按 `neck-to-feet outfit crop` 生成：画面从脖子开始裁切，只裁掉头部，必须显式显示完整左右双肩和肩线，不包含头部、脸部、五官、耳朵或头发。</w:t>
       </w:r>
     </w:p>
     <w:p>
       <w:pPr>
         <w:pStyle w:val="ListBullet"/>
-        <w:spacing w:after="40" w:line="259" w:lineRule="auto"/>
+        <w:spacing w:before="0" w:after="40" w:line="259" w:lineRule="auto"/>
       </w:pPr>
       <w:r>
         <w:rPr>
@@ -1696,13 +1726,58 @@
           <w:color w:val="20242A"/>
           <w:sz w:val="19"/>
         </w:rPr>
-        <w:t>不要露脸、不要五官、不要完整头部。</w:t>
+        <w:t>没有帽子元素时，必须显示完整上半身、完整下半身、双脚和鞋子；不允许从胸口、腰部、大腿或膝盖处裁剪，也不允许生成露脸全身图。</w:t>
       </w:r>
     </w:p>
     <w:p>
       <w:pPr>
         <w:pStyle w:val="ListBullet"/>
-        <w:spacing w:after="40" w:line="259" w:lineRule="auto"/>
+        <w:spacing w:before="0" w:after="40" w:line="259" w:lineRule="auto"/>
+      </w:pPr>
+      <w:r>
+        <w:rPr>
+          <w:rFonts w:ascii="Microsoft YaHei" w:hAnsi="Microsoft YaHei" w:eastAsia="Microsoft YaHei"/>
+          <w:b w:val="0"/>
+          <w:color w:val="20242A"/>
+          <w:sz w:val="19"/>
+        </w:rPr>
+        <w:t>如果搭配中有帽子元素，图像必须显示完整全身和完整穿搭，包括帽子、上半身、下半身和鞋子。</w:t>
+      </w:r>
+    </w:p>
+    <w:p>
+      <w:pPr>
+        <w:pStyle w:val="ListBullet"/>
+        <w:spacing w:before="0" w:after="40" w:line="259" w:lineRule="auto"/>
+      </w:pPr>
+      <w:r>
+        <w:rPr>
+          <w:rFonts w:ascii="Microsoft YaHei" w:hAnsi="Microsoft YaHei" w:eastAsia="Microsoft YaHei"/>
+          <w:b w:val="0"/>
+          <w:color w:val="20242A"/>
+          <w:sz w:val="19"/>
+        </w:rPr>
+        <w:t>有帽子元素时，脸部信息可以根据整体风格自然生成，但要协调、真实、干净，不要突兀、变形或难看。</w:t>
+      </w:r>
+    </w:p>
+    <w:p>
+      <w:pPr>
+        <w:pStyle w:val="ListBullet"/>
+        <w:spacing w:before="0" w:after="40" w:line="259" w:lineRule="auto"/>
+      </w:pPr>
+      <w:r>
+        <w:rPr>
+          <w:rFonts w:ascii="Microsoft YaHei" w:hAnsi="Microsoft YaHei" w:eastAsia="Microsoft YaHei"/>
+          <w:b w:val="0"/>
+          <w:color w:val="20242A"/>
+          <w:sz w:val="19"/>
+        </w:rPr>
+        <w:t>参考衣物图只用于提取颜色、材质、轮廓和细节，不允许照搬参考图的半身、腰部局部、腿部局部或商品裁剪构图。</w:t>
+      </w:r>
+    </w:p>
+    <w:p>
+      <w:pPr>
+        <w:pStyle w:val="ListBullet"/>
+        <w:spacing w:before="0" w:after="40" w:line="259" w:lineRule="auto"/>
       </w:pPr>
       <w:r>
         <w:rPr>
@@ -1717,7 +1792,7 @@
     <w:p>
       <w:pPr>
         <w:pStyle w:val="ListBullet"/>
-        <w:spacing w:after="40" w:line="259" w:lineRule="auto"/>
+        <w:spacing w:before="0" w:after="40" w:line="259" w:lineRule="auto"/>
       </w:pPr>
       <w:r>
         <w:rPr>
@@ -1731,7 +1806,7 @@
     </w:p>
     <w:p>
       <w:pPr>
-        <w:spacing w:before="180" w:after="60"/>
+        <w:spacing w:before="180" w:after="60" w:line="276" w:lineRule="auto"/>
       </w:pPr>
       <w:r>
         <w:rPr>
@@ -1745,7 +1820,7 @@
     </w:p>
     <w:p>
       <w:pPr>
-        <w:spacing w:after="80" w:line="276" w:lineRule="auto"/>
+        <w:spacing w:before="0" w:after="80" w:line="276" w:lineRule="auto"/>
       </w:pPr>
       <w:r>
         <w:rPr>
@@ -1760,7 +1835,7 @@
     <w:p>
       <w:pPr>
         <w:pStyle w:val="ListBullet"/>
-        <w:spacing w:after="40" w:line="259" w:lineRule="auto"/>
+        <w:spacing w:before="0" w:after="40" w:line="259" w:lineRule="auto"/>
       </w:pPr>
       <w:r>
         <w:rPr>
@@ -1775,7 +1850,7 @@
     <w:p>
       <w:pPr>
         <w:pStyle w:val="ListBullet"/>
-        <w:spacing w:after="40" w:line="259" w:lineRule="auto"/>
+        <w:spacing w:before="0" w:after="40" w:line="259" w:lineRule="auto"/>
       </w:pPr>
       <w:r>
         <w:rPr>
@@ -1790,7 +1865,7 @@
     <w:p>
       <w:pPr>
         <w:pStyle w:val="ListBullet"/>
-        <w:spacing w:after="40" w:line="259" w:lineRule="auto"/>
+        <w:spacing w:before="0" w:after="40" w:line="259" w:lineRule="auto"/>
       </w:pPr>
       <w:r>
         <w:rPr>
@@ -1804,7 +1879,7 @@
     </w:p>
     <w:p>
       <w:pPr>
-        <w:spacing w:after="80" w:line="276" w:lineRule="auto"/>
+        <w:spacing w:before="0" w:after="80" w:line="276" w:lineRule="auto"/>
       </w:pPr>
       <w:r>
         <w:rPr>
@@ -1819,7 +1894,7 @@
     <w:p>
       <w:pPr>
         <w:pStyle w:val="ListBullet"/>
-        <w:spacing w:after="40" w:line="259" w:lineRule="auto"/>
+        <w:spacing w:before="0" w:after="40" w:line="259" w:lineRule="auto"/>
       </w:pPr>
       <w:r>
         <w:rPr>
@@ -1834,7 +1909,7 @@
     <w:p>
       <w:pPr>
         <w:pStyle w:val="ListBullet"/>
-        <w:spacing w:after="40" w:line="259" w:lineRule="auto"/>
+        <w:spacing w:before="0" w:after="40" w:line="259" w:lineRule="auto"/>
       </w:pPr>
       <w:r>
         <w:rPr>
@@ -1849,7 +1924,7 @@
     <w:p>
       <w:pPr>
         <w:pStyle w:val="ListBullet"/>
-        <w:spacing w:after="40" w:line="259" w:lineRule="auto"/>
+        <w:spacing w:before="0" w:after="40" w:line="259" w:lineRule="auto"/>
       </w:pPr>
       <w:r>
         <w:rPr>
@@ -1864,7 +1939,7 @@
     <w:p>
       <w:pPr>
         <w:pStyle w:val="ListBullet"/>
-        <w:spacing w:after="40" w:line="259" w:lineRule="auto"/>
+        <w:spacing w:before="0" w:after="40" w:line="259" w:lineRule="auto"/>
       </w:pPr>
       <w:r>
         <w:rPr>
@@ -1878,7 +1953,7 @@
     </w:p>
     <w:p>
       <w:pPr>
-        <w:spacing w:before="180" w:after="60"/>
+        <w:spacing w:before="180" w:after="60" w:line="276" w:lineRule="auto"/>
       </w:pPr>
       <w:r>
         <w:rPr>
@@ -1892,7 +1967,7 @@
     </w:p>
     <w:p>
       <w:pPr>
-        <w:spacing w:after="80" w:line="276" w:lineRule="auto"/>
+        <w:spacing w:before="0" w:after="80" w:line="276" w:lineRule="auto"/>
       </w:pPr>
       <w:r>
         <w:rPr>
@@ -1907,7 +1982,7 @@
     <w:p>
       <w:pPr>
         <w:pStyle w:val="ListBullet"/>
-        <w:spacing w:after="40" w:line="259" w:lineRule="auto"/>
+        <w:spacing w:before="0" w:after="40" w:line="259" w:lineRule="auto"/>
       </w:pPr>
       <w:r>
         <w:rPr>
@@ -1922,7 +1997,7 @@
     <w:p>
       <w:pPr>
         <w:pStyle w:val="ListBullet"/>
-        <w:spacing w:after="40" w:line="259" w:lineRule="auto"/>
+        <w:spacing w:before="0" w:after="40" w:line="259" w:lineRule="auto"/>
       </w:pPr>
       <w:r>
         <w:rPr>
@@ -1937,7 +2012,7 @@
     <w:p>
       <w:pPr>
         <w:pStyle w:val="ListBullet"/>
-        <w:spacing w:after="40" w:line="259" w:lineRule="auto"/>
+        <w:spacing w:before="0" w:after="40" w:line="259" w:lineRule="auto"/>
       </w:pPr>
       <w:r>
         <w:rPr>
@@ -1952,7 +2027,7 @@
     <w:p>
       <w:pPr>
         <w:pStyle w:val="ListBullet"/>
-        <w:spacing w:after="40" w:line="259" w:lineRule="auto"/>
+        <w:spacing w:before="0" w:after="40" w:line="259" w:lineRule="auto"/>
       </w:pPr>
       <w:r>
         <w:rPr>
@@ -1967,7 +2042,7 @@
     <w:p>
       <w:pPr>
         <w:pStyle w:val="ListBullet"/>
-        <w:spacing w:after="40" w:line="259" w:lineRule="auto"/>
+        <w:spacing w:before="0" w:after="40" w:line="259" w:lineRule="auto"/>
       </w:pPr>
       <w:r>
         <w:rPr>
@@ -1982,7 +2057,7 @@
     <w:p>
       <w:pPr>
         <w:pStyle w:val="ListBullet"/>
-        <w:spacing w:after="40" w:line="259" w:lineRule="auto"/>
+        <w:spacing w:before="0" w:after="40" w:line="259" w:lineRule="auto"/>
       </w:pPr>
       <w:r>
         <w:rPr>
@@ -1997,7 +2072,7 @@
     <w:p>
       <w:pPr>
         <w:pStyle w:val="ListBullet"/>
-        <w:spacing w:after="40" w:line="259" w:lineRule="auto"/>
+        <w:spacing w:before="0" w:after="40" w:line="259" w:lineRule="auto"/>
       </w:pPr>
       <w:r>
         <w:rPr>
@@ -2012,7 +2087,7 @@
     <w:p>
       <w:pPr>
         <w:pStyle w:val="ListBullet"/>
-        <w:spacing w:after="40" w:line="259" w:lineRule="auto"/>
+        <w:spacing w:before="0" w:after="40" w:line="259" w:lineRule="auto"/>
       </w:pPr>
       <w:r>
         <w:rPr>
@@ -2027,7 +2102,7 @@
     <w:p>
       <w:pPr>
         <w:pStyle w:val="ListBullet"/>
-        <w:spacing w:after="40" w:line="259" w:lineRule="auto"/>
+        <w:spacing w:before="0" w:after="40" w:line="259" w:lineRule="auto"/>
       </w:pPr>
       <w:r>
         <w:rPr>
@@ -2042,7 +2117,7 @@
     <w:p>
       <w:pPr>
         <w:pStyle w:val="ListBullet"/>
-        <w:spacing w:after="40" w:line="259" w:lineRule="auto"/>
+        <w:spacing w:before="0" w:after="40" w:line="259" w:lineRule="auto"/>
       </w:pPr>
       <w:r>
         <w:rPr>
@@ -2057,7 +2132,7 @@
     <w:p>
       <w:pPr>
         <w:pStyle w:val="ListBullet"/>
-        <w:spacing w:after="40" w:line="259" w:lineRule="auto"/>
+        <w:spacing w:before="0" w:after="40" w:line="259" w:lineRule="auto"/>
       </w:pPr>
       <w:r>
         <w:rPr>
@@ -2066,13 +2141,13 @@
           <w:color w:val="20242A"/>
           <w:sz w:val="19"/>
         </w:rPr>
-        <w:t>穿搭效果图生成，并加入不露脸约束。</w:t>
+        <w:t>穿搭效果图生成，并加入按是否有帽子元素切换的构图约束。</w:t>
       </w:r>
     </w:p>
     <w:p>
       <w:pPr>
         <w:pStyle w:val="ListBullet"/>
-        <w:spacing w:after="40" w:line="259" w:lineRule="auto"/>
+        <w:spacing w:before="0" w:after="40" w:line="259" w:lineRule="auto"/>
       </w:pPr>
       <w:r>
         <w:rPr>
@@ -2086,7 +2161,7 @@
     </w:p>
     <w:p>
       <w:pPr>
-        <w:spacing w:after="80" w:line="276" w:lineRule="auto"/>
+        <w:spacing w:before="0" w:after="80" w:line="276" w:lineRule="auto"/>
       </w:pPr>
       <w:r>
         <w:rPr>
@@ -2101,7 +2176,7 @@
     <w:p>
       <w:pPr>
         <w:pStyle w:val="ListBullet"/>
-        <w:spacing w:after="40" w:line="259" w:lineRule="auto"/>
+        <w:spacing w:before="0" w:after="40" w:line="259" w:lineRule="auto"/>
       </w:pPr>
       <w:r>
         <w:rPr>
@@ -2116,7 +2191,7 @@
     <w:p>
       <w:pPr>
         <w:pStyle w:val="ListBullet"/>
-        <w:spacing w:after="40" w:line="259" w:lineRule="auto"/>
+        <w:spacing w:before="0" w:after="40" w:line="259" w:lineRule="auto"/>
       </w:pPr>
       <w:r>
         <w:rPr>
@@ -2131,7 +2206,7 @@
     <w:p>
       <w:pPr>
         <w:pStyle w:val="ListBullet"/>
-        <w:spacing w:after="40" w:line="259" w:lineRule="auto"/>
+        <w:spacing w:before="0" w:after="40" w:line="259" w:lineRule="auto"/>
       </w:pPr>
       <w:r>
         <w:rPr>
@@ -2146,7 +2221,7 @@
     <w:p>
       <w:pPr>
         <w:pStyle w:val="ListBullet"/>
-        <w:spacing w:after="40" w:line="259" w:lineRule="auto"/>
+        <w:spacing w:before="0" w:after="40" w:line="259" w:lineRule="auto"/>
       </w:pPr>
       <w:r>
         <w:rPr>
@@ -2161,7 +2236,7 @@
     <w:p>
       <w:pPr>
         <w:pStyle w:val="ListBullet"/>
-        <w:spacing w:after="40" w:line="259" w:lineRule="auto"/>
+        <w:spacing w:before="0" w:after="40" w:line="259" w:lineRule="auto"/>
       </w:pPr>
       <w:r>
         <w:rPr>
@@ -2176,7 +2251,7 @@
     <w:p>
       <w:pPr>
         <w:pStyle w:val="ListBullet"/>
-        <w:spacing w:after="40" w:line="259" w:lineRule="auto"/>
+        <w:spacing w:before="0" w:after="40" w:line="259" w:lineRule="auto"/>
       </w:pPr>
       <w:r>
         <w:rPr>

</xml_diff>